<commit_message>
documentation add a little and change to pdf and send
</commit_message>
<xml_diff>
--- a/app/bin/main/Surname_SessionNumber_IBCS_IA/IA_Solution_zip/Documentation/Crit_A_Planning.docx
+++ b/app/bin/main/Surname_SessionNumber_IBCS_IA/IA_Solution_zip/Documentation/Crit_A_Planning.docx
@@ -1,11 +1,10 @@
 
 <file path=word/document.xml><?xml version="1.0" encoding="utf-8"?>
-<w:document xmlns:wpc="http://schemas.microsoft.com/office/word/2010/wordprocessingCanvas" xmlns:cx="http://schemas.microsoft.com/office/drawing/2014/chartex" xmlns:cx1="http://schemas.microsoft.com/office/drawing/2015/9/8/chartex" xmlns:cx2="http://schemas.microsoft.com/office/drawing/2015/10/21/chartex" xmlns:cx3="http://schemas.microsoft.com/office/drawing/2016/5/9/chartex" xmlns:cx4="http://schemas.microsoft.com/office/drawing/2016/5/10/chartex" xmlns:cx5="http://schemas.microsoft.com/office/drawing/2016/5/11/chartex" xmlns:cx6="http://schemas.microsoft.com/office/drawing/2016/5/12/chartex" xmlns:cx7="http://schemas.microsoft.com/office/drawing/2016/5/13/chartex" xmlns:cx8="http://schemas.microsoft.com/office/drawing/2016/5/14/chartex" xmlns:mc="http://schemas.openxmlformats.org/markup-compatibility/2006" xmlns:o="urn:schemas-microsoft-com:office:office" xmlns:r="http://schemas.openxmlformats.org/officeDocument/2006/relationships" xmlns:m="http://schemas.openxmlformats.org/officeDocument/2006/math" xmlns:v="urn:schemas-microsoft-com:vml" xmlns:wp14="http://schemas.microsoft.com/office/word/2010/wordprocessingDrawing" xmlns:wp="http://schemas.openxmlformats.org/drawingml/2006/wordprocessingDrawing" xmlns:w10="urn:schemas-microsoft-com:office:word" xmlns:w="http://schemas.openxmlformats.org/wordprocessingml/2006/main" xmlns:w14="http://schemas.microsoft.com/office/word/2010/wordml" xmlns:w15="http://schemas.microsoft.com/office/word/2012/wordml" xmlns:w16se="http://schemas.microsoft.com/office/word/2015/wordml/symex" xmlns:wpg="http://schemas.microsoft.com/office/word/2010/wordprocessingGroup" xmlns:wpi="http://schemas.microsoft.com/office/word/2010/wordprocessingInk" xmlns:wne="http://schemas.microsoft.com/office/word/2006/wordml" xmlns:wps="http://schemas.microsoft.com/office/word/2010/wordprocessingShape" mc:Ignorable="w14 w15 w16se wp14">
+<w:document xmlns:wpc="http://schemas.microsoft.com/office/word/2010/wordprocessingCanvas" xmlns:cx="http://schemas.microsoft.com/office/drawing/2014/chartex" xmlns:cx1="http://schemas.microsoft.com/office/drawing/2015/9/8/chartex" xmlns:cx2="http://schemas.microsoft.com/office/drawing/2015/10/21/chartex" xmlns:cx3="http://schemas.microsoft.com/office/drawing/2016/5/9/chartex" xmlns:cx4="http://schemas.microsoft.com/office/drawing/2016/5/10/chartex" xmlns:cx5="http://schemas.microsoft.com/office/drawing/2016/5/11/chartex" xmlns:cx6="http://schemas.microsoft.com/office/drawing/2016/5/12/chartex" xmlns:cx7="http://schemas.microsoft.com/office/drawing/2016/5/13/chartex" xmlns:cx8="http://schemas.microsoft.com/office/drawing/2016/5/14/chartex" xmlns:mc="http://schemas.openxmlformats.org/markup-compatibility/2006" xmlns:aink="http://schemas.microsoft.com/office/drawing/2016/ink" xmlns:am3d="http://schemas.microsoft.com/office/drawing/2017/model3d" xmlns:o="urn:schemas-microsoft-com:office:office" xmlns:oel="http://schemas.microsoft.com/office/2019/extlst" xmlns:r="http://schemas.openxmlformats.org/officeDocument/2006/relationships" xmlns:m="http://schemas.openxmlformats.org/officeDocument/2006/math" xmlns:v="urn:schemas-microsoft-com:vml" xmlns:wp14="http://schemas.microsoft.com/office/word/2010/wordprocessingDrawing" xmlns:wp="http://schemas.openxmlformats.org/drawingml/2006/wordprocessingDrawing" xmlns:w10="urn:schemas-microsoft-com:office:word" xmlns:w="http://schemas.openxmlformats.org/wordprocessingml/2006/main" xmlns:w14="http://schemas.microsoft.com/office/word/2010/wordml" xmlns:w15="http://schemas.microsoft.com/office/word/2012/wordml" xmlns:w16cex="http://schemas.microsoft.com/office/word/2018/wordml/cex" xmlns:w16cid="http://schemas.microsoft.com/office/word/2016/wordml/cid" xmlns:w16="http://schemas.microsoft.com/office/word/2018/wordml" xmlns:w16sdtdh="http://schemas.microsoft.com/office/word/2020/wordml/sdtdatahash" xmlns:w16se="http://schemas.microsoft.com/office/word/2015/wordml/symex" xmlns:wpg="http://schemas.microsoft.com/office/word/2010/wordprocessingGroup" xmlns:wpi="http://schemas.microsoft.com/office/word/2010/wordprocessingInk" xmlns:wne="http://schemas.microsoft.com/office/word/2006/wordml" xmlns:wps="http://schemas.microsoft.com/office/word/2010/wordprocessingShape" mc:Ignorable="w14 w15 w16se w16cid w16 w16cex w16sdtdh wp14">
   <w:body>
     <w:p>
       <w:pPr>
         <w:pStyle w:val="Heading2"/>
-        <w:jc w:val="center"/>
       </w:pPr>
       <w:r>
         <w:t xml:space="preserve">Criterion </w:t>
@@ -22,8 +21,295 @@
     </w:p>
     <w:p/>
     <w:p>
-      <w:bookmarkStart w:id="0" w:name="_GoBack"/>
-      <w:bookmarkEnd w:id="0"/>
+      <w:r>
+        <w:t>Defining the Problem:</w:t>
+      </w:r>
+    </w:p>
+    <w:p>
+      <w:pPr>
+        <w:ind w:firstLine="720"/>
+      </w:pPr>
+      <w:r>
+        <w:t xml:space="preserve">The client for this project is </w:t>
+      </w:r>
+      <w:r>
+        <w:t xml:space="preserve">my brother’s friend with </w:t>
+      </w:r>
+      <w:r>
+        <w:t xml:space="preserve">ADHD </w:t>
+      </w:r>
+      <w:r>
+        <w:t>that</w:t>
+      </w:r>
+      <w:r>
+        <w:t xml:space="preserve"> has difficulty keeping track of tasks throughout the day. The reason for </w:t>
+      </w:r>
+      <w:r>
+        <w:t xml:space="preserve">choosing my client </w:t>
+      </w:r>
+      <w:r>
+        <w:t>is to provide a solution that can help people with ADHD manage their tasks and stay organized despite their condition.</w:t>
+      </w:r>
+      <w:r>
+        <w:t xml:space="preserve"> </w:t>
+      </w:r>
+      <w:r>
+        <w:t xml:space="preserve">I have chosen </w:t>
+      </w:r>
+      <w:r>
+        <w:t>my</w:t>
+      </w:r>
+      <w:r>
+        <w:t xml:space="preserve"> computer science teacher as my adviser due to his expertise and background in project management. </w:t>
+      </w:r>
+      <w:r>
+        <w:t xml:space="preserve"> </w:t>
+      </w:r>
+      <w:r>
+        <w:t>The problem I aim to solve is how to design and implement a reminder system that effectively meets the needs of someone with ADHD. After consulting with the client, I proposed a solution in the form of a desktop application that would include various features such as real-time progress tracking, texting reminders to the client's phone, and a text interface.</w:t>
+      </w:r>
+      <w:r>
+        <w:t xml:space="preserve"> </w:t>
+      </w:r>
+    </w:p>
+    <w:p>
+      <w:r>
+        <w:t>Success</w:t>
+      </w:r>
+      <w:r>
+        <w:t xml:space="preserve"> </w:t>
+      </w:r>
+      <w:r>
+        <w:t>Criteria</w:t>
+      </w:r>
+      <w:r>
+        <w:t>:</w:t>
+      </w:r>
+    </w:p>
+    <w:p>
+      <w:pPr>
+        <w:numPr>
+          <w:ilvl w:val="0"/>
+          <w:numId w:val="24"/>
+        </w:numPr>
+      </w:pPr>
+      <w:r>
+        <w:t xml:space="preserve">The program will allow the client to create a reminder with </w:t>
+      </w:r>
+      <w:r>
+        <w:t>parameters (</w:t>
+      </w:r>
+      <w:r>
+        <w:t>Title,</w:t>
+      </w:r>
+      <w:r>
+        <w:t xml:space="preserve"> </w:t>
+      </w:r>
+      <w:r>
+        <w:t>duration,</w:t>
+      </w:r>
+      <w:r>
+        <w:t xml:space="preserve"> </w:t>
+      </w:r>
+      <w:r>
+        <w:t>completion).</w:t>
+      </w:r>
+    </w:p>
+    <w:p>
+      <w:pPr>
+        <w:numPr>
+          <w:ilvl w:val="0"/>
+          <w:numId w:val="24"/>
+        </w:numPr>
+      </w:pPr>
+      <w:r>
+        <w:t>The app should have a user-friendly interface that is easy to navigate.</w:t>
+      </w:r>
+    </w:p>
+    <w:p>
+      <w:pPr>
+        <w:numPr>
+          <w:ilvl w:val="0"/>
+          <w:numId w:val="24"/>
+        </w:numPr>
+      </w:pPr>
+      <w:r>
+        <w:t xml:space="preserve">Each reminder should have a progress bar associated with </w:t>
+      </w:r>
+      <w:r>
+        <w:t>it.</w:t>
+      </w:r>
+    </w:p>
+    <w:p>
+      <w:pPr>
+        <w:numPr>
+          <w:ilvl w:val="0"/>
+          <w:numId w:val="24"/>
+        </w:numPr>
+      </w:pPr>
+      <w:r>
+        <w:t xml:space="preserve">The reminder should notify the client via push notification </w:t>
+      </w:r>
+      <w:r>
+        <w:t>when the timer is exhausted.</w:t>
+      </w:r>
+    </w:p>
+    <w:p>
+      <w:pPr>
+        <w:numPr>
+          <w:ilvl w:val="0"/>
+          <w:numId w:val="24"/>
+        </w:numPr>
+      </w:pPr>
+      <w:r>
+        <w:t>The program will display each reminder with its corresponding values.</w:t>
+      </w:r>
+    </w:p>
+    <w:p>
+      <w:pPr>
+        <w:numPr>
+          <w:ilvl w:val="0"/>
+          <w:numId w:val="24"/>
+        </w:numPr>
+      </w:pPr>
+      <w:r>
+        <w:t xml:space="preserve">The </w:t>
+      </w:r>
+      <w:r>
+        <w:t>program</w:t>
+      </w:r>
+      <w:r>
+        <w:t xml:space="preserve"> should be reliable and should not crash or have any technical issues.</w:t>
+      </w:r>
+    </w:p>
+    <w:p>
+      <w:pPr>
+        <w:numPr>
+          <w:ilvl w:val="0"/>
+          <w:numId w:val="24"/>
+        </w:numPr>
+      </w:pPr>
+      <w:r>
+        <w:t xml:space="preserve">The program will sort the list given a </w:t>
+      </w:r>
+      <w:r>
+        <w:t>priority.</w:t>
+      </w:r>
+    </w:p>
+    <w:p>
+      <w:pPr>
+        <w:numPr>
+          <w:ilvl w:val="0"/>
+          <w:numId w:val="24"/>
+        </w:numPr>
+      </w:pPr>
+      <w:r>
+        <w:t>The program will allow reminders to be days long, to record a streak.</w:t>
+      </w:r>
+    </w:p>
+    <w:p>
+      <w:pPr>
+        <w:ind w:left="1080"/>
+      </w:pPr>
+    </w:p>
+    <w:p>
+      <w:pPr>
+        <w:ind w:firstLine="720"/>
+      </w:pPr>
+    </w:p>
+    <w:p>
+      <w:r>
+        <w:t xml:space="preserve">Rationale for Proposed </w:t>
+      </w:r>
+      <w:r>
+        <w:t>Solution</w:t>
+      </w:r>
+      <w:r>
+        <w:t>:</w:t>
+      </w:r>
+    </w:p>
+    <w:p>
+      <w:pPr>
+        <w:ind w:firstLine="720"/>
+      </w:pPr>
+      <w:r>
+        <w:t xml:space="preserve">The proposed product is a </w:t>
+      </w:r>
+      <w:r>
+        <w:t xml:space="preserve">program </w:t>
+      </w:r>
+      <w:r>
+        <w:t>called "</w:t>
+      </w:r>
+      <w:r>
+        <w:t>Remind Me</w:t>
+      </w:r>
+      <w:r>
+        <w:t xml:space="preserve">" that will help people with ADHD manage their time and tasks </w:t>
+      </w:r>
+      <w:r>
+        <w:t>effectively.</w:t>
+      </w:r>
+      <w:r>
+        <w:t xml:space="preserve"> Due</w:t>
+      </w:r>
+      <w:r>
+        <w:t xml:space="preserve"> to the nature of creating multiple reminders with the same parameters, I have chosen Java an OOP that allows me to abstract the problem.</w:t>
+      </w:r>
+      <w:r>
+        <w:t xml:space="preserve"> </w:t>
+      </w:r>
+      <w:r>
+        <w:t xml:space="preserve">After consultation with the client and advisor, it became clear that a standalone Java </w:t>
+      </w:r>
+      <w:r>
+        <w:t xml:space="preserve">program </w:t>
+      </w:r>
+      <w:r>
+        <w:t xml:space="preserve">was the most suitable solution due to its platform independence and ease of development. The client expressed dissatisfaction with current solutions like paper-based organizers and digital calendars, which lacked features like task prioritization and reminders. The </w:t>
+      </w:r>
+      <w:r>
+        <w:t>“</w:t>
+      </w:r>
+      <w:r>
+        <w:t>Remind Me</w:t>
+      </w:r>
+      <w:r>
+        <w:t>”</w:t>
+      </w:r>
+      <w:r>
+        <w:t xml:space="preserve"> program</w:t>
+      </w:r>
+      <w:r>
+        <w:t xml:space="preserve"> will solve this problem by allowing users to create </w:t>
+      </w:r>
+      <w:r>
+        <w:t>tasks and</w:t>
+      </w:r>
+      <w:r>
+        <w:t xml:space="preserve"> receive reminders at specified times. The app will also have a customizable user interface to accommodate different preferences and needs. The choice of Java as the programming language </w:t>
+      </w:r>
+      <w:r>
+        <w:t xml:space="preserve">is due to </w:t>
+      </w:r>
+      <w:r>
+        <w:t xml:space="preserve">its platform independence, wide community </w:t>
+      </w:r>
+      <w:r>
+        <w:lastRenderedPageBreak/>
+        <w:t xml:space="preserve">support, and robust libraries for building </w:t>
+      </w:r>
+      <w:r>
+        <w:t>standalone apps</w:t>
+      </w:r>
+      <w:r>
+        <w:t xml:space="preserve">. Communication with the client and advisor has been ongoing throughout the project to ensure that the product meets the client's needs and preferences. Other solutions considered included web-based applications and mobile apps, but these were deemed less suitable due to potential accessibility and privacy issues. </w:t>
+      </w:r>
+    </w:p>
+    <w:p>
+      <w:pPr>
+        <w:ind w:firstLine="720"/>
+      </w:pPr>
     </w:p>
     <w:sectPr>
       <w:pgSz w:w="11906" w:h="16838"/>
@@ -36,7 +322,7 @@
 </file>
 
 <file path=word/numbering.xml><?xml version="1.0" encoding="utf-8"?>
-<w:numbering xmlns:wpc="http://schemas.microsoft.com/office/word/2010/wordprocessingCanvas" xmlns:cx="http://schemas.microsoft.com/office/drawing/2014/chartex" xmlns:cx1="http://schemas.microsoft.com/office/drawing/2015/9/8/chartex" xmlns:cx2="http://schemas.microsoft.com/office/drawing/2015/10/21/chartex" xmlns:cx3="http://schemas.microsoft.com/office/drawing/2016/5/9/chartex" xmlns:cx4="http://schemas.microsoft.com/office/drawing/2016/5/10/chartex" xmlns:cx5="http://schemas.microsoft.com/office/drawing/2016/5/11/chartex" xmlns:cx6="http://schemas.microsoft.com/office/drawing/2016/5/12/chartex" xmlns:cx7="http://schemas.microsoft.com/office/drawing/2016/5/13/chartex" xmlns:cx8="http://schemas.microsoft.com/office/drawing/2016/5/14/chartex" xmlns:mc="http://schemas.openxmlformats.org/markup-compatibility/2006" xmlns:o="urn:schemas-microsoft-com:office:office" xmlns:r="http://schemas.openxmlformats.org/officeDocument/2006/relationships" xmlns:m="http://schemas.openxmlformats.org/officeDocument/2006/math" xmlns:v="urn:schemas-microsoft-com:vml" xmlns:wp14="http://schemas.microsoft.com/office/word/2010/wordprocessingDrawing" xmlns:wp="http://schemas.openxmlformats.org/drawingml/2006/wordprocessingDrawing" xmlns:w10="urn:schemas-microsoft-com:office:word" xmlns:w="http://schemas.openxmlformats.org/wordprocessingml/2006/main" xmlns:w14="http://schemas.microsoft.com/office/word/2010/wordml" xmlns:w15="http://schemas.microsoft.com/office/word/2012/wordml" xmlns:w16se="http://schemas.microsoft.com/office/word/2015/wordml/symex" xmlns:wpg="http://schemas.microsoft.com/office/word/2010/wordprocessingGroup" xmlns:wpi="http://schemas.microsoft.com/office/word/2010/wordprocessingInk" xmlns:wne="http://schemas.microsoft.com/office/word/2006/wordml" xmlns:wps="http://schemas.microsoft.com/office/word/2010/wordprocessingShape" mc:Ignorable="w14 w15 w16se wp14">
+<w:numbering xmlns:wpc="http://schemas.microsoft.com/office/word/2010/wordprocessingCanvas" xmlns:cx="http://schemas.microsoft.com/office/drawing/2014/chartex" xmlns:cx1="http://schemas.microsoft.com/office/drawing/2015/9/8/chartex" xmlns:cx2="http://schemas.microsoft.com/office/drawing/2015/10/21/chartex" xmlns:cx3="http://schemas.microsoft.com/office/drawing/2016/5/9/chartex" xmlns:cx4="http://schemas.microsoft.com/office/drawing/2016/5/10/chartex" xmlns:cx5="http://schemas.microsoft.com/office/drawing/2016/5/11/chartex" xmlns:cx6="http://schemas.microsoft.com/office/drawing/2016/5/12/chartex" xmlns:cx7="http://schemas.microsoft.com/office/drawing/2016/5/13/chartex" xmlns:cx8="http://schemas.microsoft.com/office/drawing/2016/5/14/chartex" xmlns:mc="http://schemas.openxmlformats.org/markup-compatibility/2006" xmlns:aink="http://schemas.microsoft.com/office/drawing/2016/ink" xmlns:am3d="http://schemas.microsoft.com/office/drawing/2017/model3d" xmlns:o="urn:schemas-microsoft-com:office:office" xmlns:oel="http://schemas.microsoft.com/office/2019/extlst" xmlns:r="http://schemas.openxmlformats.org/officeDocument/2006/relationships" xmlns:m="http://schemas.openxmlformats.org/officeDocument/2006/math" xmlns:v="urn:schemas-microsoft-com:vml" xmlns:wp14="http://schemas.microsoft.com/office/word/2010/wordprocessingDrawing" xmlns:wp="http://schemas.openxmlformats.org/drawingml/2006/wordprocessingDrawing" xmlns:w10="urn:schemas-microsoft-com:office:word" xmlns:w="http://schemas.openxmlformats.org/wordprocessingml/2006/main" xmlns:w14="http://schemas.microsoft.com/office/word/2010/wordml" xmlns:w15="http://schemas.microsoft.com/office/word/2012/wordml" xmlns:w16cex="http://schemas.microsoft.com/office/word/2018/wordml/cex" xmlns:w16cid="http://schemas.microsoft.com/office/word/2016/wordml/cid" xmlns:w16="http://schemas.microsoft.com/office/word/2018/wordml" xmlns:w16sdtdh="http://schemas.microsoft.com/office/word/2020/wordml/sdtdatahash" xmlns:w16se="http://schemas.microsoft.com/office/word/2015/wordml/symex" xmlns:wpg="http://schemas.microsoft.com/office/word/2010/wordprocessingGroup" xmlns:wpi="http://schemas.microsoft.com/office/word/2010/wordprocessingInk" xmlns:wne="http://schemas.microsoft.com/office/word/2006/wordml" xmlns:wps="http://schemas.microsoft.com/office/word/2010/wordprocessingShape" mc:Ignorable="w14 w15 w16se w16cid w16 w16cex w16sdtdh wp14">
   <w:abstractNum w:abstractNumId="0" w15:restartNumberingAfterBreak="0">
     <w:nsid w:val="00253046"/>
     <w:multiLevelType w:val="hybridMultilevel"/>
@@ -490,6 +776,95 @@
     </w:lvl>
   </w:abstractNum>
   <w:abstractNum w:abstractNumId="4" w15:restartNumberingAfterBreak="0">
+    <w:nsid w:val="0E8F4265"/>
+    <w:multiLevelType w:val="hybridMultilevel"/>
+    <w:tmpl w:val="19CC0BE4"/>
+    <w:lvl w:ilvl="0" w:tplc="CDEC53AA">
+      <w:start w:val="1"/>
+      <w:numFmt w:val="decimal"/>
+      <w:lvlText w:val="%1."/>
+      <w:lvlJc w:val="left"/>
+      <w:pPr>
+        <w:ind w:left="1080" w:hanging="360"/>
+      </w:pPr>
+      <w:rPr>
+        <w:rFonts w:hint="default"/>
+      </w:rPr>
+    </w:lvl>
+    <w:lvl w:ilvl="1" w:tplc="04090019" w:tentative="1">
+      <w:start w:val="1"/>
+      <w:numFmt w:val="lowerLetter"/>
+      <w:lvlText w:val="%2."/>
+      <w:lvlJc w:val="left"/>
+      <w:pPr>
+        <w:ind w:left="1800" w:hanging="360"/>
+      </w:pPr>
+    </w:lvl>
+    <w:lvl w:ilvl="2" w:tplc="0409001B" w:tentative="1">
+      <w:start w:val="1"/>
+      <w:numFmt w:val="lowerRoman"/>
+      <w:lvlText w:val="%3."/>
+      <w:lvlJc w:val="right"/>
+      <w:pPr>
+        <w:ind w:left="2520" w:hanging="180"/>
+      </w:pPr>
+    </w:lvl>
+    <w:lvl w:ilvl="3" w:tplc="0409000F" w:tentative="1">
+      <w:start w:val="1"/>
+      <w:numFmt w:val="decimal"/>
+      <w:lvlText w:val="%4."/>
+      <w:lvlJc w:val="left"/>
+      <w:pPr>
+        <w:ind w:left="3240" w:hanging="360"/>
+      </w:pPr>
+    </w:lvl>
+    <w:lvl w:ilvl="4" w:tplc="04090019" w:tentative="1">
+      <w:start w:val="1"/>
+      <w:numFmt w:val="lowerLetter"/>
+      <w:lvlText w:val="%5."/>
+      <w:lvlJc w:val="left"/>
+      <w:pPr>
+        <w:ind w:left="3960" w:hanging="360"/>
+      </w:pPr>
+    </w:lvl>
+    <w:lvl w:ilvl="5" w:tplc="0409001B" w:tentative="1">
+      <w:start w:val="1"/>
+      <w:numFmt w:val="lowerRoman"/>
+      <w:lvlText w:val="%6."/>
+      <w:lvlJc w:val="right"/>
+      <w:pPr>
+        <w:ind w:left="4680" w:hanging="180"/>
+      </w:pPr>
+    </w:lvl>
+    <w:lvl w:ilvl="6" w:tplc="0409000F" w:tentative="1">
+      <w:start w:val="1"/>
+      <w:numFmt w:val="decimal"/>
+      <w:lvlText w:val="%7."/>
+      <w:lvlJc w:val="left"/>
+      <w:pPr>
+        <w:ind w:left="5400" w:hanging="360"/>
+      </w:pPr>
+    </w:lvl>
+    <w:lvl w:ilvl="7" w:tplc="04090019" w:tentative="1">
+      <w:start w:val="1"/>
+      <w:numFmt w:val="lowerLetter"/>
+      <w:lvlText w:val="%8."/>
+      <w:lvlJc w:val="left"/>
+      <w:pPr>
+        <w:ind w:left="6120" w:hanging="360"/>
+      </w:pPr>
+    </w:lvl>
+    <w:lvl w:ilvl="8" w:tplc="0409001B" w:tentative="1">
+      <w:start w:val="1"/>
+      <w:numFmt w:val="lowerRoman"/>
+      <w:lvlText w:val="%9."/>
+      <w:lvlJc w:val="right"/>
+      <w:pPr>
+        <w:ind w:left="6840" w:hanging="180"/>
+      </w:pPr>
+    </w:lvl>
+  </w:abstractNum>
+  <w:abstractNum w:abstractNumId="5" w15:restartNumberingAfterBreak="0">
     <w:nsid w:val="0F084A5D"/>
     <w:multiLevelType w:val="hybridMultilevel"/>
     <w:tmpl w:val="2AC2CB2C"/>
@@ -602,7 +977,7 @@
       </w:rPr>
     </w:lvl>
   </w:abstractNum>
-  <w:abstractNum w:abstractNumId="5" w15:restartNumberingAfterBreak="0">
+  <w:abstractNum w:abstractNumId="6" w15:restartNumberingAfterBreak="0">
     <w:nsid w:val="0F6D020A"/>
     <w:multiLevelType w:val="hybridMultilevel"/>
     <w:tmpl w:val="C5E6A668"/>
@@ -715,7 +1090,7 @@
       </w:rPr>
     </w:lvl>
   </w:abstractNum>
-  <w:abstractNum w:abstractNumId="6" w15:restartNumberingAfterBreak="0">
+  <w:abstractNum w:abstractNumId="7" w15:restartNumberingAfterBreak="0">
     <w:nsid w:val="13D57566"/>
     <w:multiLevelType w:val="hybridMultilevel"/>
     <w:tmpl w:val="1BFE4E58"/>
@@ -831,7 +1206,7 @@
       </w:rPr>
     </w:lvl>
   </w:abstractNum>
-  <w:abstractNum w:abstractNumId="7" w15:restartNumberingAfterBreak="0">
+  <w:abstractNum w:abstractNumId="8" w15:restartNumberingAfterBreak="0">
     <w:nsid w:val="1A4C7DB1"/>
     <w:multiLevelType w:val="hybridMultilevel"/>
     <w:tmpl w:val="75DE2C36"/>
@@ -944,7 +1319,7 @@
       </w:rPr>
     </w:lvl>
   </w:abstractNum>
-  <w:abstractNum w:abstractNumId="8" w15:restartNumberingAfterBreak="0">
+  <w:abstractNum w:abstractNumId="9" w15:restartNumberingAfterBreak="0">
     <w:nsid w:val="1C3B4430"/>
     <w:multiLevelType w:val="hybridMultilevel"/>
     <w:tmpl w:val="577A5B68"/>
@@ -1057,7 +1432,7 @@
       </w:rPr>
     </w:lvl>
   </w:abstractNum>
-  <w:abstractNum w:abstractNumId="9" w15:restartNumberingAfterBreak="0">
+  <w:abstractNum w:abstractNumId="10" w15:restartNumberingAfterBreak="0">
     <w:nsid w:val="1D916C25"/>
     <w:multiLevelType w:val="hybridMultilevel"/>
     <w:tmpl w:val="0DC0E92A"/>
@@ -1170,7 +1545,7 @@
       </w:rPr>
     </w:lvl>
   </w:abstractNum>
-  <w:abstractNum w:abstractNumId="10" w15:restartNumberingAfterBreak="0">
+  <w:abstractNum w:abstractNumId="11" w15:restartNumberingAfterBreak="0">
     <w:nsid w:val="20910665"/>
     <w:multiLevelType w:val="hybridMultilevel"/>
     <w:tmpl w:val="2D8CC7B4"/>
@@ -1283,7 +1658,7 @@
       </w:rPr>
     </w:lvl>
   </w:abstractNum>
-  <w:abstractNum w:abstractNumId="11" w15:restartNumberingAfterBreak="0">
+  <w:abstractNum w:abstractNumId="12" w15:restartNumberingAfterBreak="0">
     <w:nsid w:val="23F829E6"/>
     <w:multiLevelType w:val="hybridMultilevel"/>
     <w:tmpl w:val="F7867A76"/>
@@ -1396,7 +1771,7 @@
       </w:rPr>
     </w:lvl>
   </w:abstractNum>
-  <w:abstractNum w:abstractNumId="12" w15:restartNumberingAfterBreak="0">
+  <w:abstractNum w:abstractNumId="13" w15:restartNumberingAfterBreak="0">
     <w:nsid w:val="27C4360B"/>
     <w:multiLevelType w:val="hybridMultilevel"/>
     <w:tmpl w:val="1318025E"/>
@@ -1509,7 +1884,7 @@
       </w:rPr>
     </w:lvl>
   </w:abstractNum>
-  <w:abstractNum w:abstractNumId="13" w15:restartNumberingAfterBreak="0">
+  <w:abstractNum w:abstractNumId="14" w15:restartNumberingAfterBreak="0">
     <w:nsid w:val="27D012B1"/>
     <w:multiLevelType w:val="hybridMultilevel"/>
     <w:tmpl w:val="0DC0E92A"/>
@@ -1622,7 +1997,7 @@
       </w:rPr>
     </w:lvl>
   </w:abstractNum>
-  <w:abstractNum w:abstractNumId="14" w15:restartNumberingAfterBreak="0">
+  <w:abstractNum w:abstractNumId="15" w15:restartNumberingAfterBreak="0">
     <w:nsid w:val="2BAB7774"/>
     <w:multiLevelType w:val="hybridMultilevel"/>
     <w:tmpl w:val="F7A4EEDE"/>
@@ -1735,7 +2110,7 @@
       </w:rPr>
     </w:lvl>
   </w:abstractNum>
-  <w:abstractNum w:abstractNumId="15" w15:restartNumberingAfterBreak="0">
+  <w:abstractNum w:abstractNumId="16" w15:restartNumberingAfterBreak="0">
     <w:nsid w:val="45B60C93"/>
     <w:multiLevelType w:val="hybridMultilevel"/>
     <w:tmpl w:val="1C0EB93A"/>
@@ -1848,7 +2223,7 @@
       </w:rPr>
     </w:lvl>
   </w:abstractNum>
-  <w:abstractNum w:abstractNumId="16" w15:restartNumberingAfterBreak="0">
+  <w:abstractNum w:abstractNumId="17" w15:restartNumberingAfterBreak="0">
     <w:nsid w:val="48C74260"/>
     <w:multiLevelType w:val="hybridMultilevel"/>
     <w:tmpl w:val="46C41BEE"/>
@@ -1961,7 +2336,7 @@
       </w:rPr>
     </w:lvl>
   </w:abstractNum>
-  <w:abstractNum w:abstractNumId="17" w15:restartNumberingAfterBreak="0">
+  <w:abstractNum w:abstractNumId="18" w15:restartNumberingAfterBreak="0">
     <w:nsid w:val="4E3E753A"/>
     <w:multiLevelType w:val="hybridMultilevel"/>
     <w:tmpl w:val="E2743E9C"/>
@@ -2074,7 +2449,7 @@
       </w:rPr>
     </w:lvl>
   </w:abstractNum>
-  <w:abstractNum w:abstractNumId="18" w15:restartNumberingAfterBreak="0">
+  <w:abstractNum w:abstractNumId="19" w15:restartNumberingAfterBreak="0">
     <w:nsid w:val="4F886907"/>
     <w:multiLevelType w:val="hybridMultilevel"/>
     <w:tmpl w:val="07383BF8"/>
@@ -2187,7 +2562,7 @@
       </w:rPr>
     </w:lvl>
   </w:abstractNum>
-  <w:abstractNum w:abstractNumId="19" w15:restartNumberingAfterBreak="0">
+  <w:abstractNum w:abstractNumId="20" w15:restartNumberingAfterBreak="0">
     <w:nsid w:val="52211131"/>
     <w:multiLevelType w:val="hybridMultilevel"/>
     <w:tmpl w:val="0DC0E92A"/>
@@ -2300,7 +2675,7 @@
       </w:rPr>
     </w:lvl>
   </w:abstractNum>
-  <w:abstractNum w:abstractNumId="20" w15:restartNumberingAfterBreak="0">
+  <w:abstractNum w:abstractNumId="21" w15:restartNumberingAfterBreak="0">
     <w:nsid w:val="5F4D5CE4"/>
     <w:multiLevelType w:val="hybridMultilevel"/>
     <w:tmpl w:val="9F68F0B8"/>
@@ -2413,7 +2788,7 @@
       </w:rPr>
     </w:lvl>
   </w:abstractNum>
-  <w:abstractNum w:abstractNumId="21" w15:restartNumberingAfterBreak="0">
+  <w:abstractNum w:abstractNumId="22" w15:restartNumberingAfterBreak="0">
     <w:nsid w:val="61A256E1"/>
     <w:multiLevelType w:val="hybridMultilevel"/>
     <w:tmpl w:val="0DC0E92A"/>
@@ -2526,7 +2901,7 @@
       </w:rPr>
     </w:lvl>
   </w:abstractNum>
-  <w:abstractNum w:abstractNumId="22" w15:restartNumberingAfterBreak="0">
+  <w:abstractNum w:abstractNumId="23" w15:restartNumberingAfterBreak="0">
     <w:nsid w:val="61F65A11"/>
     <w:multiLevelType w:val="hybridMultilevel"/>
     <w:tmpl w:val="F7867A76"/>
@@ -2639,80 +3014,83 @@
       </w:rPr>
     </w:lvl>
   </w:abstractNum>
-  <w:num w:numId="1">
+  <w:num w:numId="1" w16cid:durableId="824056323">
     <w:abstractNumId w:val="0"/>
   </w:num>
-  <w:num w:numId="2">
+  <w:num w:numId="2" w16cid:durableId="218590856">
+    <w:abstractNumId w:val="19"/>
+  </w:num>
+  <w:num w:numId="3" w16cid:durableId="1245725235">
+    <w:abstractNumId w:val="13"/>
+  </w:num>
+  <w:num w:numId="4" w16cid:durableId="1706369632">
+    <w:abstractNumId w:val="2"/>
+  </w:num>
+  <w:num w:numId="5" w16cid:durableId="534316578">
+    <w:abstractNumId w:val="8"/>
+  </w:num>
+  <w:num w:numId="6" w16cid:durableId="105933354">
+    <w:abstractNumId w:val="21"/>
+  </w:num>
+  <w:num w:numId="7" w16cid:durableId="1353917688">
+    <w:abstractNumId w:val="16"/>
+  </w:num>
+  <w:num w:numId="8" w16cid:durableId="1174108099">
+    <w:abstractNumId w:val="5"/>
+  </w:num>
+  <w:num w:numId="9" w16cid:durableId="883979239">
+    <w:abstractNumId w:val="6"/>
+  </w:num>
+  <w:num w:numId="10" w16cid:durableId="1930576424">
+    <w:abstractNumId w:val="10"/>
+  </w:num>
+  <w:num w:numId="11" w16cid:durableId="526254905">
+    <w:abstractNumId w:val="20"/>
+  </w:num>
+  <w:num w:numId="12" w16cid:durableId="1838688908">
+    <w:abstractNumId w:val="14"/>
+  </w:num>
+  <w:num w:numId="13" w16cid:durableId="213083554">
+    <w:abstractNumId w:val="22"/>
+  </w:num>
+  <w:num w:numId="14" w16cid:durableId="50622862">
+    <w:abstractNumId w:val="9"/>
+  </w:num>
+  <w:num w:numId="15" w16cid:durableId="1558544259">
+    <w:abstractNumId w:val="23"/>
+  </w:num>
+  <w:num w:numId="16" w16cid:durableId="1490710230">
+    <w:abstractNumId w:val="1"/>
+  </w:num>
+  <w:num w:numId="17" w16cid:durableId="793133277">
+    <w:abstractNumId w:val="12"/>
+  </w:num>
+  <w:num w:numId="18" w16cid:durableId="2065398627">
+    <w:abstractNumId w:val="3"/>
+  </w:num>
+  <w:num w:numId="19" w16cid:durableId="1920171790">
+    <w:abstractNumId w:val="15"/>
+  </w:num>
+  <w:num w:numId="20" w16cid:durableId="208807272">
+    <w:abstractNumId w:val="17"/>
+  </w:num>
+  <w:num w:numId="21" w16cid:durableId="1081683877">
+    <w:abstractNumId w:val="11"/>
+  </w:num>
+  <w:num w:numId="22" w16cid:durableId="672298545">
     <w:abstractNumId w:val="18"/>
   </w:num>
-  <w:num w:numId="3">
-    <w:abstractNumId w:val="12"/>
-  </w:num>
-  <w:num w:numId="4">
-    <w:abstractNumId w:val="2"/>
-  </w:num>
-  <w:num w:numId="5">
+  <w:num w:numId="23" w16cid:durableId="475025320">
     <w:abstractNumId w:val="7"/>
   </w:num>
-  <w:num w:numId="6">
-    <w:abstractNumId w:val="20"/>
-  </w:num>
-  <w:num w:numId="7">
-    <w:abstractNumId w:val="15"/>
-  </w:num>
-  <w:num w:numId="8">
+  <w:num w:numId="24" w16cid:durableId="72556311">
     <w:abstractNumId w:val="4"/>
-  </w:num>
-  <w:num w:numId="9">
-    <w:abstractNumId w:val="5"/>
-  </w:num>
-  <w:num w:numId="10">
-    <w:abstractNumId w:val="9"/>
-  </w:num>
-  <w:num w:numId="11">
-    <w:abstractNumId w:val="19"/>
-  </w:num>
-  <w:num w:numId="12">
-    <w:abstractNumId w:val="13"/>
-  </w:num>
-  <w:num w:numId="13">
-    <w:abstractNumId w:val="21"/>
-  </w:num>
-  <w:num w:numId="14">
-    <w:abstractNumId w:val="8"/>
-  </w:num>
-  <w:num w:numId="15">
-    <w:abstractNumId w:val="22"/>
-  </w:num>
-  <w:num w:numId="16">
-    <w:abstractNumId w:val="1"/>
-  </w:num>
-  <w:num w:numId="17">
-    <w:abstractNumId w:val="11"/>
-  </w:num>
-  <w:num w:numId="18">
-    <w:abstractNumId w:val="3"/>
-  </w:num>
-  <w:num w:numId="19">
-    <w:abstractNumId w:val="14"/>
-  </w:num>
-  <w:num w:numId="20">
-    <w:abstractNumId w:val="16"/>
-  </w:num>
-  <w:num w:numId="21">
-    <w:abstractNumId w:val="10"/>
-  </w:num>
-  <w:num w:numId="22">
-    <w:abstractNumId w:val="17"/>
-  </w:num>
-  <w:num w:numId="23">
-    <w:abstractNumId w:val="6"/>
   </w:num>
 </w:numbering>
 </file>
 
 <file path=word/styles.xml><?xml version="1.0" encoding="utf-8"?>
-<w:styles xmlns:mc="http://schemas.openxmlformats.org/markup-compatibility/2006" xmlns:r="http://schemas.openxmlformats.org/officeDocument/2006/relationships" xmlns:w="http://schemas.openxmlformats.org/wordprocessingml/2006/main" xmlns:w14="http://schemas.microsoft.com/office/word/2010/wordml" xmlns:w15="http://schemas.microsoft.com/office/word/2012/wordml" xmlns:w16se="http://schemas.microsoft.com/office/word/2015/wordml/symex" mc:Ignorable="w14 w15 w16se">
+<w:styles xmlns:mc="http://schemas.openxmlformats.org/markup-compatibility/2006" xmlns:r="http://schemas.openxmlformats.org/officeDocument/2006/relationships" xmlns:w="http://schemas.openxmlformats.org/wordprocessingml/2006/main" xmlns:w14="http://schemas.microsoft.com/office/word/2010/wordml" xmlns:w15="http://schemas.microsoft.com/office/word/2012/wordml" xmlns:w16cex="http://schemas.microsoft.com/office/word/2018/wordml/cex" xmlns:w16cid="http://schemas.microsoft.com/office/word/2016/wordml/cid" xmlns:w16="http://schemas.microsoft.com/office/word/2018/wordml" xmlns:w16sdtdh="http://schemas.microsoft.com/office/word/2020/wordml/sdtdatahash" xmlns:w16se="http://schemas.microsoft.com/office/word/2015/wordml/symex" mc:Ignorable="w14 w15 w16se w16cid w16 w16cex w16sdtdh">
   <w:docDefaults>
     <w:rPrDefault>
       <w:rPr>
@@ -2722,7 +3100,7 @@
     </w:rPrDefault>
     <w:pPrDefault/>
   </w:docDefaults>
-  <w:latentStyles w:defLockedState="0" w:defUIPriority="99" w:defSemiHidden="0" w:defUnhideWhenUsed="0" w:defQFormat="0" w:count="374">
+  <w:latentStyles w:defLockedState="0" w:defUIPriority="99" w:defSemiHidden="0" w:defUnhideWhenUsed="0" w:defQFormat="0" w:count="376">
     <w:lsdException w:name="Normal" w:uiPriority="0" w:qFormat="1"/>
     <w:lsdException w:name="heading 1" w:uiPriority="9" w:qFormat="1"/>
     <w:lsdException w:name="heading 2" w:uiPriority="9" w:qFormat="1"/>
@@ -2754,8 +3132,54 @@
     <w:lsdException w:name="Subtitle" w:uiPriority="11" w:qFormat="1"/>
     <w:lsdException w:name="Strong" w:uiPriority="22" w:qFormat="1"/>
     <w:lsdException w:name="Emphasis" w:uiPriority="20" w:qFormat="1"/>
+    <w:lsdException w:name="HTML Typewriter" w:semiHidden="1" w:unhideWhenUsed="1"/>
+    <w:lsdException w:name="Normal Table" w:semiHidden="1" w:unhideWhenUsed="1"/>
+    <w:lsdException w:name="Outline List 2" w:semiHidden="1" w:unhideWhenUsed="1"/>
+    <w:lsdException w:name="Outline List 3" w:semiHidden="1" w:unhideWhenUsed="1"/>
+    <w:lsdException w:name="Table Simple 1" w:semiHidden="1" w:unhideWhenUsed="1"/>
+    <w:lsdException w:name="Table Simple 2" w:semiHidden="1" w:unhideWhenUsed="1"/>
+    <w:lsdException w:name="Table Simple 3" w:semiHidden="1" w:unhideWhenUsed="1"/>
+    <w:lsdException w:name="Table Classic 1" w:semiHidden="1" w:unhideWhenUsed="1"/>
+    <w:lsdException w:name="Table Classic 2" w:semiHidden="1" w:unhideWhenUsed="1"/>
+    <w:lsdException w:name="Table Classic 3" w:semiHidden="1" w:unhideWhenUsed="1"/>
+    <w:lsdException w:name="Table Classic 4" w:semiHidden="1" w:unhideWhenUsed="1"/>
+    <w:lsdException w:name="Table Colorful 1" w:semiHidden="1" w:unhideWhenUsed="1"/>
+    <w:lsdException w:name="Table Colorful 2" w:semiHidden="1" w:unhideWhenUsed="1"/>
+    <w:lsdException w:name="Table Colorful 3" w:semiHidden="1" w:unhideWhenUsed="1"/>
+    <w:lsdException w:name="Table Columns 1" w:semiHidden="1" w:unhideWhenUsed="1"/>
+    <w:lsdException w:name="Table Columns 2" w:semiHidden="1" w:unhideWhenUsed="1"/>
+    <w:lsdException w:name="Table Columns 3" w:semiHidden="1" w:unhideWhenUsed="1"/>
+    <w:lsdException w:name="Table Columns 4" w:semiHidden="1" w:unhideWhenUsed="1"/>
+    <w:lsdException w:name="Table Columns 5" w:semiHidden="1" w:unhideWhenUsed="1"/>
+    <w:lsdException w:name="Table Grid 1" w:semiHidden="1" w:unhideWhenUsed="1"/>
+    <w:lsdException w:name="Table Grid 2" w:semiHidden="1" w:unhideWhenUsed="1"/>
+    <w:lsdException w:name="Table Grid 3" w:semiHidden="1" w:unhideWhenUsed="1"/>
+    <w:lsdException w:name="Table Grid 4" w:semiHidden="1" w:unhideWhenUsed="1"/>
+    <w:lsdException w:name="Table Grid 5" w:semiHidden="1" w:unhideWhenUsed="1"/>
+    <w:lsdException w:name="Table Grid 6" w:semiHidden="1" w:unhideWhenUsed="1"/>
+    <w:lsdException w:name="Table Grid 7" w:semiHidden="1" w:unhideWhenUsed="1"/>
+    <w:lsdException w:name="Table Grid 8" w:semiHidden="1" w:unhideWhenUsed="1"/>
+    <w:lsdException w:name="Table List 1" w:semiHidden="1" w:unhideWhenUsed="1"/>
+    <w:lsdException w:name="Table List 2" w:semiHidden="1" w:unhideWhenUsed="1"/>
+    <w:lsdException w:name="Table List 3" w:semiHidden="1" w:unhideWhenUsed="1"/>
+    <w:lsdException w:name="Table List 4" w:semiHidden="1" w:unhideWhenUsed="1"/>
+    <w:lsdException w:name="Table List 5" w:semiHidden="1" w:unhideWhenUsed="1"/>
+    <w:lsdException w:name="Table List 6" w:semiHidden="1" w:unhideWhenUsed="1"/>
+    <w:lsdException w:name="Table List 7" w:semiHidden="1" w:unhideWhenUsed="1"/>
+    <w:lsdException w:name="Table List 8" w:semiHidden="1" w:unhideWhenUsed="1"/>
+    <w:lsdException w:name="Table 3D effects 1" w:semiHidden="1" w:unhideWhenUsed="1"/>
+    <w:lsdException w:name="Table 3D effects 2" w:semiHidden="1" w:unhideWhenUsed="1"/>
+    <w:lsdException w:name="Table 3D effects 3" w:semiHidden="1" w:unhideWhenUsed="1"/>
+    <w:lsdException w:name="Table Contemporary" w:semiHidden="1" w:unhideWhenUsed="1"/>
+    <w:lsdException w:name="Table Elegant" w:semiHidden="1" w:unhideWhenUsed="1"/>
+    <w:lsdException w:name="Table Professional" w:semiHidden="1" w:unhideWhenUsed="1"/>
+    <w:lsdException w:name="Table Subtle 1" w:semiHidden="1" w:unhideWhenUsed="1"/>
+    <w:lsdException w:name="Table Subtle 2" w:semiHidden="1" w:unhideWhenUsed="1"/>
+    <w:lsdException w:name="Table Web 1" w:semiHidden="1" w:unhideWhenUsed="1"/>
+    <w:lsdException w:name="Table Web 2" w:semiHidden="1" w:unhideWhenUsed="1"/>
+    <w:lsdException w:name="Table Web 3" w:semiHidden="1" w:unhideWhenUsed="1"/>
     <w:lsdException w:name="Balloon Text" w:semiHidden="1" w:unhideWhenUsed="1"/>
-    <w:lsdException w:name="Table Grid" w:semiHidden="1" w:uiPriority="59" w:unhideWhenUsed="1"/>
+    <w:lsdException w:name="Table Grid" w:uiPriority="59"/>
     <w:lsdException w:name="Table Theme" w:semiHidden="1" w:unhideWhenUsed="1"/>
     <w:lsdException w:name="Placeholder Text" w:semiHidden="1"/>
     <w:lsdException w:name="No Spacing" w:uiPriority="1" w:qFormat="1"/>
@@ -2867,7 +3291,7 @@
     <w:lsdException w:name="Intense Reference" w:uiPriority="32" w:qFormat="1"/>
     <w:lsdException w:name="Book Title" w:uiPriority="33" w:qFormat="1"/>
     <w:lsdException w:name="Bibliography" w:semiHidden="1" w:uiPriority="37" w:unhideWhenUsed="1"/>
-    <w:lsdException w:name="TOC Heading" w:uiPriority="39" w:qFormat="1"/>
+    <w:lsdException w:name="TOC Heading" w:semiHidden="1" w:uiPriority="39" w:unhideWhenUsed="1" w:qFormat="1"/>
     <w:lsdException w:name="Plain Table 1" w:uiPriority="41"/>
     <w:lsdException w:name="Plain Table 2" w:uiPriority="42"/>
     <w:lsdException w:name="Plain Table 3" w:uiPriority="43"/>
@@ -2975,6 +3399,8 @@
     <w:lsdException w:name="Mention" w:semiHidden="1" w:unhideWhenUsed="1"/>
     <w:lsdException w:name="Smart Hyperlink" w:semiHidden="1" w:unhideWhenUsed="1"/>
     <w:lsdException w:name="Hashtag" w:semiHidden="1" w:unhideWhenUsed="1"/>
+    <w:lsdException w:name="Unresolved Mention" w:semiHidden="1" w:unhideWhenUsed="1"/>
+    <w:lsdException w:name="Smart Link" w:semiHidden="1" w:unhideWhenUsed="1"/>
   </w:latentStyles>
   <w:style w:type="paragraph" w:default="1" w:styleId="Normal">
     <w:name w:val="Normal"/>
@@ -4015,10 +4441,304 @@
 <b:Sources xmlns:b="http://schemas.openxmlformats.org/officeDocument/2006/bibliography" xmlns="http://schemas.openxmlformats.org/officeDocument/2006/bibliography" SelectedStyle="\APA.XSL" StyleName="APA"/>
 </file>
 
+<file path=customXml/item2.xml><?xml version="1.0" encoding="utf-8"?>
+<p:properties xmlns:p="http://schemas.microsoft.com/office/2006/metadata/properties" xmlns:xsi="http://www.w3.org/2001/XMLSchema-instance" xmlns:pc="http://schemas.microsoft.com/office/infopath/2007/PartnerControls">
+  <documentManagement/>
+</p:properties>
+</file>
+
+<file path=customXml/item3.xml><?xml version="1.0" encoding="utf-8"?>
+<?mso-contentType ?>
+<FormTemplates xmlns="http://schemas.microsoft.com/sharepoint/v3/contenttype/forms">
+  <Display>DocumentLibraryForm</Display>
+  <Edit>DocumentLibraryForm</Edit>
+  <New>DocumentLibraryForm</New>
+</FormTemplates>
+</file>
+
+<file path=customXml/item4.xml><?xml version="1.0" encoding="utf-8"?>
+<ct:contentTypeSchema xmlns:ct="http://schemas.microsoft.com/office/2006/metadata/contentType" xmlns:ma="http://schemas.microsoft.com/office/2006/metadata/properties/metaAttributes" ct:_="" ma:_="" ma:contentTypeName="Document" ma:contentTypeID="0x010100F93FDF6E0178D94A896BA8D23198D55B" ma:contentTypeVersion="15" ma:contentTypeDescription="Create a new document." ma:contentTypeScope="" ma:versionID="322bf9cb525ac7c9edf875ff45e37bc4">
+  <xsd:schema xmlns:xsd="http://www.w3.org/2001/XMLSchema" xmlns:xs="http://www.w3.org/2001/XMLSchema" xmlns:p="http://schemas.microsoft.com/office/2006/metadata/properties" xmlns:ns3="56274229-afbd-461f-b11e-5bd3f2156ea4" xmlns:ns4="7afa4cb0-4990-4417-b591-bcc4d74da64e" targetNamespace="http://schemas.microsoft.com/office/2006/metadata/properties" ma:root="true" ma:fieldsID="e359e2f663321321e1d845d2edc46f3e" ns3:_="" ns4:_="">
+    <xsd:import namespace="56274229-afbd-461f-b11e-5bd3f2156ea4"/>
+    <xsd:import namespace="7afa4cb0-4990-4417-b591-bcc4d74da64e"/>
+    <xsd:element name="properties">
+      <xsd:complexType>
+        <xsd:sequence>
+          <xsd:element name="documentManagement">
+            <xsd:complexType>
+              <xsd:all>
+                <xsd:element ref="ns3:MediaServiceMetadata" minOccurs="0"/>
+                <xsd:element ref="ns3:MediaServiceFastMetadata" minOccurs="0"/>
+                <xsd:element ref="ns3:MediaServiceAutoTags" minOccurs="0"/>
+                <xsd:element ref="ns3:MediaServiceGenerationTime" minOccurs="0"/>
+                <xsd:element ref="ns3:MediaServiceEventHashCode" minOccurs="0"/>
+                <xsd:element ref="ns3:MediaServiceOCR" minOccurs="0"/>
+                <xsd:element ref="ns4:SharedWithUsers" minOccurs="0"/>
+                <xsd:element ref="ns4:SharedWithDetails" minOccurs="0"/>
+                <xsd:element ref="ns4:SharingHintHash" minOccurs="0"/>
+                <xsd:element ref="ns3:MediaServiceDateTaken" minOccurs="0"/>
+                <xsd:element ref="ns3:MediaServiceAutoKeyPoints" minOccurs="0"/>
+                <xsd:element ref="ns3:MediaServiceKeyPoints" minOccurs="0"/>
+                <xsd:element ref="ns3:MediaServiceLocation" minOccurs="0"/>
+                <xsd:element ref="ns3:MediaLengthInSeconds" minOccurs="0"/>
+                <xsd:element ref="ns3:MediaServiceSearchProperties" minOccurs="0"/>
+              </xsd:all>
+            </xsd:complexType>
+          </xsd:element>
+        </xsd:sequence>
+      </xsd:complexType>
+    </xsd:element>
+  </xsd:schema>
+  <xsd:schema xmlns:xsd="http://www.w3.org/2001/XMLSchema" xmlns:xs="http://www.w3.org/2001/XMLSchema" xmlns:dms="http://schemas.microsoft.com/office/2006/documentManagement/types" xmlns:pc="http://schemas.microsoft.com/office/infopath/2007/PartnerControls" targetNamespace="56274229-afbd-461f-b11e-5bd3f2156ea4" elementFormDefault="qualified">
+    <xsd:import namespace="http://schemas.microsoft.com/office/2006/documentManagement/types"/>
+    <xsd:import namespace="http://schemas.microsoft.com/office/infopath/2007/PartnerControls"/>
+    <xsd:element name="MediaServiceMetadata" ma:index="8" nillable="true" ma:displayName="MediaServiceMetadata" ma:hidden="true" ma:internalName="MediaServiceMetadata" ma:readOnly="true">
+      <xsd:simpleType>
+        <xsd:restriction base="dms:Note"/>
+      </xsd:simpleType>
+    </xsd:element>
+    <xsd:element name="MediaServiceFastMetadata" ma:index="9" nillable="true" ma:displayName="MediaServiceFastMetadata" ma:hidden="true" ma:internalName="MediaServiceFastMetadata" ma:readOnly="true">
+      <xsd:simpleType>
+        <xsd:restriction base="dms:Note"/>
+      </xsd:simpleType>
+    </xsd:element>
+    <xsd:element name="MediaServiceAutoTags" ma:index="10" nillable="true" ma:displayName="Tags" ma:internalName="MediaServiceAutoTags" ma:readOnly="true">
+      <xsd:simpleType>
+        <xsd:restriction base="dms:Text"/>
+      </xsd:simpleType>
+    </xsd:element>
+    <xsd:element name="MediaServiceGenerationTime" ma:index="11" nillable="true" ma:displayName="MediaServiceGenerationTime" ma:hidden="true" ma:internalName="MediaServiceGenerationTime" ma:readOnly="true">
+      <xsd:simpleType>
+        <xsd:restriction base="dms:Text"/>
+      </xsd:simpleType>
+    </xsd:element>
+    <xsd:element name="MediaServiceEventHashCode" ma:index="12" nillable="true" ma:displayName="MediaServiceEventHashCode" ma:hidden="true" ma:internalName="MediaServiceEventHashCode" ma:readOnly="true">
+      <xsd:simpleType>
+        <xsd:restriction base="dms:Text"/>
+      </xsd:simpleType>
+    </xsd:element>
+    <xsd:element name="MediaServiceOCR" ma:index="13" nillable="true" ma:displayName="Extracted Text" ma:internalName="MediaServiceOCR" ma:readOnly="true">
+      <xsd:simpleType>
+        <xsd:restriction base="dms:Note">
+          <xsd:maxLength value="255"/>
+        </xsd:restriction>
+      </xsd:simpleType>
+    </xsd:element>
+    <xsd:element name="MediaServiceDateTaken" ma:index="17" nillable="true" ma:displayName="MediaServiceDateTaken" ma:hidden="true" ma:internalName="MediaServiceDateTaken" ma:readOnly="true">
+      <xsd:simpleType>
+        <xsd:restriction base="dms:Text"/>
+      </xsd:simpleType>
+    </xsd:element>
+    <xsd:element name="MediaServiceAutoKeyPoints" ma:index="18" nillable="true" ma:displayName="MediaServiceAutoKeyPoints" ma:hidden="true" ma:internalName="MediaServiceAutoKeyPoints" ma:readOnly="true">
+      <xsd:simpleType>
+        <xsd:restriction base="dms:Note"/>
+      </xsd:simpleType>
+    </xsd:element>
+    <xsd:element name="MediaServiceKeyPoints" ma:index="19" nillable="true" ma:displayName="KeyPoints" ma:internalName="MediaServiceKeyPoints" ma:readOnly="true">
+      <xsd:simpleType>
+        <xsd:restriction base="dms:Note">
+          <xsd:maxLength value="255"/>
+        </xsd:restriction>
+      </xsd:simpleType>
+    </xsd:element>
+    <xsd:element name="MediaServiceLocation" ma:index="20" nillable="true" ma:displayName="Location" ma:internalName="MediaServiceLocation" ma:readOnly="true">
+      <xsd:simpleType>
+        <xsd:restriction base="dms:Text"/>
+      </xsd:simpleType>
+    </xsd:element>
+    <xsd:element name="MediaLengthInSeconds" ma:index="21" nillable="true" ma:displayName="Length (seconds)" ma:internalName="MediaLengthInSeconds" ma:readOnly="true">
+      <xsd:simpleType>
+        <xsd:restriction base="dms:Unknown"/>
+      </xsd:simpleType>
+    </xsd:element>
+    <xsd:element name="MediaServiceSearchProperties" ma:index="22" nillable="true" ma:displayName="MediaServiceSearchProperties" ma:hidden="true" ma:internalName="MediaServiceSearchProperties" ma:readOnly="true">
+      <xsd:simpleType>
+        <xsd:restriction base="dms:Note"/>
+      </xsd:simpleType>
+    </xsd:element>
+  </xsd:schema>
+  <xsd:schema xmlns:xsd="http://www.w3.org/2001/XMLSchema" xmlns:xs="http://www.w3.org/2001/XMLSchema" xmlns:dms="http://schemas.microsoft.com/office/2006/documentManagement/types" xmlns:pc="http://schemas.microsoft.com/office/infopath/2007/PartnerControls" targetNamespace="7afa4cb0-4990-4417-b591-bcc4d74da64e" elementFormDefault="qualified">
+    <xsd:import namespace="http://schemas.microsoft.com/office/2006/documentManagement/types"/>
+    <xsd:import namespace="http://schemas.microsoft.com/office/infopath/2007/PartnerControls"/>
+    <xsd:element name="SharedWithUsers" ma:index="14" nillable="true" ma:displayName="Shared With" ma:internalName="SharedWithUsers" ma:readOnly="true">
+      <xsd:complexType>
+        <xsd:complexContent>
+          <xsd:extension base="dms:UserMulti">
+            <xsd:sequence>
+              <xsd:element name="UserInfo" minOccurs="0" maxOccurs="unbounded">
+                <xsd:complexType>
+                  <xsd:sequence>
+                    <xsd:element name="DisplayName" type="xsd:string" minOccurs="0"/>
+                    <xsd:element name="AccountId" type="dms:UserId" minOccurs="0" nillable="true"/>
+                    <xsd:element name="AccountType" type="xsd:string" minOccurs="0"/>
+                  </xsd:sequence>
+                </xsd:complexType>
+              </xsd:element>
+            </xsd:sequence>
+          </xsd:extension>
+        </xsd:complexContent>
+      </xsd:complexType>
+    </xsd:element>
+    <xsd:element name="SharedWithDetails" ma:index="15" nillable="true" ma:displayName="Shared With Details" ma:internalName="SharedWithDetails" ma:readOnly="true">
+      <xsd:simpleType>
+        <xsd:restriction base="dms:Note">
+          <xsd:maxLength value="255"/>
+        </xsd:restriction>
+      </xsd:simpleType>
+    </xsd:element>
+    <xsd:element name="SharingHintHash" ma:index="16" nillable="true" ma:displayName="Sharing Hint Hash" ma:hidden="true" ma:internalName="SharingHintHash" ma:readOnly="true">
+      <xsd:simpleType>
+        <xsd:restriction base="dms:Text"/>
+      </xsd:simpleType>
+    </xsd:element>
+  </xsd:schema>
+  <xsd:schema xmlns="http://schemas.openxmlformats.org/package/2006/metadata/core-properties" xmlns:xsd="http://www.w3.org/2001/XMLSchema" xmlns:xsi="http://www.w3.org/2001/XMLSchema-instance" xmlns:dc="http://purl.org/dc/elements/1.1/" xmlns:dcterms="http://purl.org/dc/terms/" xmlns:odoc="http://schemas.microsoft.com/internal/obd" targetNamespace="http://schemas.openxmlformats.org/package/2006/metadata/core-properties" elementFormDefault="qualified" attributeFormDefault="unqualified" blockDefault="#all">
+    <xsd:import namespace="http://purl.org/dc/elements/1.1/" schemaLocation="http://dublincore.org/schemas/xmls/qdc/2003/04/02/dc.xsd"/>
+    <xsd:import namespace="http://purl.org/dc/terms/" schemaLocation="http://dublincore.org/schemas/xmls/qdc/2003/04/02/dcterms.xsd"/>
+    <xsd:element name="coreProperties" type="CT_coreProperties"/>
+    <xsd:complexType name="CT_coreProperties">
+      <xsd:all>
+        <xsd:element ref="dc:creator" minOccurs="0" maxOccurs="1"/>
+        <xsd:element ref="dcterms:created" minOccurs="0" maxOccurs="1"/>
+        <xsd:element ref="dc:identifier" minOccurs="0" maxOccurs="1"/>
+        <xsd:element name="contentType" minOccurs="0" maxOccurs="1" type="xsd:string" ma:index="0" ma:displayName="Content Type"/>
+        <xsd:element ref="dc:title" minOccurs="0" maxOccurs="1" ma:index="4" ma:displayName="Title"/>
+        <xsd:element ref="dc:subject" minOccurs="0" maxOccurs="1"/>
+        <xsd:element ref="dc:description" minOccurs="0" maxOccurs="1"/>
+        <xsd:element name="keywords" minOccurs="0" maxOccurs="1" type="xsd:string"/>
+        <xsd:element ref="dc:language" minOccurs="0" maxOccurs="1"/>
+        <xsd:element name="category" minOccurs="0" maxOccurs="1" type="xsd:string"/>
+        <xsd:element name="version" minOccurs="0" maxOccurs="1" type="xsd:string"/>
+        <xsd:element name="revision" minOccurs="0" maxOccurs="1" type="xsd:string">
+          <xsd:annotation>
+            <xsd:documentation>
+                        This value indicates the number of saves or revisions. The application is responsible for updating this value after each revision.
+                    </xsd:documentation>
+          </xsd:annotation>
+        </xsd:element>
+        <xsd:element name="lastModifiedBy" minOccurs="0" maxOccurs="1" type="xsd:string"/>
+        <xsd:element ref="dcterms:modified" minOccurs="0" maxOccurs="1"/>
+        <xsd:element name="contentStatus" minOccurs="0" maxOccurs="1" type="xsd:string"/>
+      </xsd:all>
+    </xsd:complexType>
+  </xsd:schema>
+  <xs:schema xmlns:pc="http://schemas.microsoft.com/office/infopath/2007/PartnerControls" xmlns:xs="http://www.w3.org/2001/XMLSchema" targetNamespace="http://schemas.microsoft.com/office/infopath/2007/PartnerControls" elementFormDefault="qualified" attributeFormDefault="unqualified">
+    <xs:element name="Person">
+      <xs:complexType>
+        <xs:sequence>
+          <xs:element ref="pc:DisplayName" minOccurs="0"/>
+          <xs:element ref="pc:AccountId" minOccurs="0"/>
+          <xs:element ref="pc:AccountType" minOccurs="0"/>
+        </xs:sequence>
+      </xs:complexType>
+    </xs:element>
+    <xs:element name="DisplayName" type="xs:string"/>
+    <xs:element name="AccountId" type="xs:string"/>
+    <xs:element name="AccountType" type="xs:string"/>
+    <xs:element name="BDCAssociatedEntity">
+      <xs:complexType>
+        <xs:sequence>
+          <xs:element ref="pc:BDCEntity" minOccurs="0" maxOccurs="unbounded"/>
+        </xs:sequence>
+        <xs:attribute ref="pc:EntityNamespace"/>
+        <xs:attribute ref="pc:EntityName"/>
+        <xs:attribute ref="pc:SystemInstanceName"/>
+        <xs:attribute ref="pc:AssociationName"/>
+      </xs:complexType>
+    </xs:element>
+    <xs:attribute name="EntityNamespace" type="xs:string"/>
+    <xs:attribute name="EntityName" type="xs:string"/>
+    <xs:attribute name="SystemInstanceName" type="xs:string"/>
+    <xs:attribute name="AssociationName" type="xs:string"/>
+    <xs:element name="BDCEntity">
+      <xs:complexType>
+        <xs:sequence>
+          <xs:element ref="pc:EntityDisplayName" minOccurs="0"/>
+          <xs:element ref="pc:EntityInstanceReference" minOccurs="0"/>
+          <xs:element ref="pc:EntityId1" minOccurs="0"/>
+          <xs:element ref="pc:EntityId2" minOccurs="0"/>
+          <xs:element ref="pc:EntityId3" minOccurs="0"/>
+          <xs:element ref="pc:EntityId4" minOccurs="0"/>
+          <xs:element ref="pc:EntityId5" minOccurs="0"/>
+        </xs:sequence>
+      </xs:complexType>
+    </xs:element>
+    <xs:element name="EntityDisplayName" type="xs:string"/>
+    <xs:element name="EntityInstanceReference" type="xs:string"/>
+    <xs:element name="EntityId1" type="xs:string"/>
+    <xs:element name="EntityId2" type="xs:string"/>
+    <xs:element name="EntityId3" type="xs:string"/>
+    <xs:element name="EntityId4" type="xs:string"/>
+    <xs:element name="EntityId5" type="xs:string"/>
+    <xs:element name="Terms">
+      <xs:complexType>
+        <xs:sequence>
+          <xs:element ref="pc:TermInfo" minOccurs="0" maxOccurs="unbounded"/>
+        </xs:sequence>
+      </xs:complexType>
+    </xs:element>
+    <xs:element name="TermInfo">
+      <xs:complexType>
+        <xs:sequence>
+          <xs:element ref="pc:TermName" minOccurs="0"/>
+          <xs:element ref="pc:TermId" minOccurs="0"/>
+        </xs:sequence>
+      </xs:complexType>
+    </xs:element>
+    <xs:element name="TermName" type="xs:string"/>
+    <xs:element name="TermId" type="xs:string"/>
+  </xs:schema>
+</ct:contentTypeSchema>
+</file>
+
 <file path=customXml/itemProps1.xml><?xml version="1.0" encoding="utf-8"?>
 <ds:datastoreItem xmlns:ds="http://schemas.openxmlformats.org/officeDocument/2006/customXml" ds:itemID="{2D72E29B-4B1E-4468-B23F-A86FC3B37FB8}">
   <ds:schemaRefs>
     <ds:schemaRef ds:uri="http://schemas.openxmlformats.org/officeDocument/2006/bibliography"/>
   </ds:schemaRefs>
 </ds:datastoreItem>
+</file>
+
+<file path=customXml/itemProps2.xml><?xml version="1.0" encoding="utf-8"?>
+<ds:datastoreItem xmlns:ds="http://schemas.openxmlformats.org/officeDocument/2006/customXml" ds:itemID="{B5F62FE8-59B5-4E2F-AD8A-AEE17E2753EC}">
+  <ds:schemaRefs>
+    <ds:schemaRef ds:uri="http://purl.org/dc/terms/"/>
+    <ds:schemaRef ds:uri="http://purl.org/dc/elements/1.1/"/>
+    <ds:schemaRef ds:uri="http://schemas.openxmlformats.org/package/2006/metadata/core-properties"/>
+    <ds:schemaRef ds:uri="http://purl.org/dc/dcmitype/"/>
+    <ds:schemaRef ds:uri="http://schemas.microsoft.com/office/2006/metadata/properties"/>
+    <ds:schemaRef ds:uri="http://schemas.microsoft.com/office/2006/documentManagement/types"/>
+    <ds:schemaRef ds:uri="56274229-afbd-461f-b11e-5bd3f2156ea4"/>
+    <ds:schemaRef ds:uri="http://www.w3.org/XML/1998/namespace"/>
+    <ds:schemaRef ds:uri="http://schemas.microsoft.com/office/infopath/2007/PartnerControls"/>
+    <ds:schemaRef ds:uri="7afa4cb0-4990-4417-b591-bcc4d74da64e"/>
+  </ds:schemaRefs>
+</ds:datastoreItem>
+</file>
+
+<file path=customXml/itemProps3.xml><?xml version="1.0" encoding="utf-8"?>
+<ds:datastoreItem xmlns:ds="http://schemas.openxmlformats.org/officeDocument/2006/customXml" ds:itemID="{B6503CEF-27B0-4571-B701-59951C85DCE9}">
+  <ds:schemaRefs>
+    <ds:schemaRef ds:uri="http://schemas.microsoft.com/sharepoint/v3/contenttype/forms"/>
+  </ds:schemaRefs>
+</ds:datastoreItem>
+</file>
+
+<file path=customXml/itemProps4.xml><?xml version="1.0" encoding="utf-8"?>
+<ds:datastoreItem xmlns:ds="http://schemas.openxmlformats.org/officeDocument/2006/customXml" ds:itemID="{3FC0A7FD-364B-4A00-8F46-8AF97792AFF3}">
+  <ds:schemaRefs>
+    <ds:schemaRef ds:uri="http://schemas.microsoft.com/office/2006/metadata/contentType"/>
+    <ds:schemaRef ds:uri="http://schemas.microsoft.com/office/2006/metadata/properties/metaAttributes"/>
+    <ds:schemaRef ds:uri="http://www.w3.org/2001/XMLSchema"/>
+    <ds:schemaRef ds:uri="http://schemas.microsoft.com/office/2006/metadata/properties"/>
+    <ds:schemaRef ds:uri="56274229-afbd-461f-b11e-5bd3f2156ea4"/>
+    <ds:schemaRef ds:uri="7afa4cb0-4990-4417-b591-bcc4d74da64e"/>
+    <ds:schemaRef ds:uri="http://schemas.microsoft.com/office/2006/documentManagement/types"/>
+    <ds:schemaRef ds:uri="http://schemas.microsoft.com/office/infopath/2007/PartnerControls"/>
+    <ds:schemaRef ds:uri="http://schemas.openxmlformats.org/package/2006/metadata/core-properties"/>
+    <ds:schemaRef ds:uri="http://purl.org/dc/elements/1.1/"/>
+    <ds:schemaRef ds:uri="http://purl.org/dc/terms/"/>
+    <ds:schemaRef ds:uri="http://schemas.microsoft.com/internal/obd"/>
+  </ds:schemaRefs>
+</ds:datastoreItem>
 </file>
</xml_diff>